<commit_message>
Update HANDOFF.md, master WO checklist, and add Kawa reference papers
HANDOFF: rolling state current through 2026-04-17 (SCHEMA-02, CLAIMS-02,
KAWA-UI-01A, KAWA-02A all noted). Checklist: 11 items moved to Completed,
Kawa roadmap added under Memoir System. References: 4 Kawa/OT papers.

Co-Authored-By: Claude Opus 4.6 <noreply@anthropic.com>
</commit_message>
<xml_diff>
--- a/Hornelore-WO-Checklist.docx
+++ b/Hornelore-WO-Checklist.docx
@@ -26,14 +26,564 @@
           <w:color w:val="666666"/>
           <w:sz w:val="18"/>
         </w:rPr>
-        <w:t>Printed: April 16, 2026  |  Priority Order: Top = Do First</w:t>
+        <w:t>Updated: April 17, 2026  |  Priority Order: Top = Do First</w:t>
       </w:r>
     </w:p>
     <w:p/>
     <w:p>
       <w:pPr>
         <w:pBdr>
-          <w:bottom w:val="single" w:sz="6" w:space="1" w:color="1A5C8A"/>
+          <w:bottom w:val="single" w:sz="6" w:space="1" w:color="2E7D32"/>
+        </w:pBdr>
+      </w:pPr>
+      <w:r>
+        <w:rPr>
+          <w:rFonts w:ascii="Arial" w:hAnsi="Arial"/>
+          <w:b/>
+          <w:color w:val="2E7D32"/>
+          <w:sz w:val="26"/>
+        </w:rPr>
+        <w:t>COMPLETED — Shipped &amp; Verified</w:t>
+      </w:r>
+    </w:p>
+    <w:p>
+      <w:pPr>
+        <w:ind w:left="360"/>
+      </w:pPr>
+      <w:r>
+        <w:rPr>
+          <w:rFonts w:ascii="Arial" w:hAnsi="Arial"/>
+          <w:color w:val="2E7D32"/>
+          <w:sz w:val="24"/>
+        </w:rPr>
+        <w:t xml:space="preserve">☑  </w:t>
+      </w:r>
+      <w:r>
+        <w:rPr>
+          <w:rFonts w:ascii="Arial" w:hAnsi="Arial"/>
+          <w:b/>
+          <w:color w:val="2E7D32"/>
+          <w:sz w:val="20"/>
+        </w:rPr>
+        <w:t>WO-EX-01C</w:t>
+      </w:r>
+      <w:r>
+        <w:rPr>
+          <w:rFonts w:ascii="Arial" w:hAnsi="Arial"/>
+          <w:color w:val="2E7D32"/>
+          <w:sz w:val="20"/>
+        </w:rPr>
+        <w:t xml:space="preserve">  —  Narrator-identity subject guard + birth-context filter</w:t>
+      </w:r>
+    </w:p>
+    <w:p>
+      <w:pPr>
+        <w:ind w:left="864"/>
+      </w:pPr>
+      <w:r>
+        <w:rPr>
+          <w:rFonts w:ascii="Arial" w:hAnsi="Arial"/>
+          <w:i/>
+          <w:color w:val="666666"/>
+          <w:sz w:val="18"/>
+        </w:rPr>
+        <w:t>Live-proven. Closed “west Fargo → placeOfBirth” and “Cole’s DOB → narrator DOB” bugs.</w:t>
+      </w:r>
+    </w:p>
+    <w:p>
+      <w:pPr>
+        <w:ind w:left="360"/>
+      </w:pPr>
+      <w:r>
+        <w:rPr>
+          <w:rFonts w:ascii="Arial" w:hAnsi="Arial"/>
+          <w:color w:val="2E7D32"/>
+          <w:sz w:val="24"/>
+        </w:rPr>
+        <w:t xml:space="preserve">☑  </w:t>
+      </w:r>
+      <w:r>
+        <w:rPr>
+          <w:rFonts w:ascii="Arial" w:hAnsi="Arial"/>
+          <w:b/>
+          <w:color w:val="2E7D32"/>
+          <w:sz w:val="20"/>
+        </w:rPr>
+        <w:t>WO-EX-01D</w:t>
+      </w:r>
+      <w:r>
+        <w:rPr>
+          <w:rFonts w:ascii="Arial" w:hAnsi="Arial"/>
+          <w:color w:val="2E7D32"/>
+          <w:sz w:val="20"/>
+        </w:rPr>
+        <w:t xml:space="preserve">  —  Field-value sanity blacklists (US state abbr, stopwords)</w:t>
+      </w:r>
+    </w:p>
+    <w:p>
+      <w:pPr>
+        <w:ind w:left="864"/>
+      </w:pPr>
+      <w:r>
+        <w:rPr>
+          <w:rFonts w:ascii="Arial" w:hAnsi="Arial"/>
+          <w:i/>
+          <w:color w:val="666666"/>
+          <w:sz w:val="18"/>
+        </w:rPr>
+        <w:t>Live-proven. Closed “Stanley/ND” and “and/dad” token-fragment bugs.</w:t>
+      </w:r>
+    </w:p>
+    <w:p>
+      <w:pPr>
+        <w:ind w:left="360"/>
+      </w:pPr>
+      <w:r>
+        <w:rPr>
+          <w:rFonts w:ascii="Arial" w:hAnsi="Arial"/>
+          <w:color w:val="2E7D32"/>
+          <w:sz w:val="24"/>
+        </w:rPr>
+        <w:t xml:space="preserve">☑  </w:t>
+      </w:r>
+      <w:r>
+        <w:rPr>
+          <w:rFonts w:ascii="Arial" w:hAnsi="Arial"/>
+          <w:b/>
+          <w:color w:val="2E7D32"/>
+          <w:sz w:val="20"/>
+        </w:rPr>
+        <w:t>WO-EX-SCHEMA-01</w:t>
+      </w:r>
+      <w:r>
+        <w:rPr>
+          <w:rFonts w:ascii="Arial" w:hAnsi="Arial"/>
+          <w:color w:val="2E7D32"/>
+          <w:sz w:val="20"/>
+        </w:rPr>
+        <w:t xml:space="preserve">  —  family.* and residence.* field families + repeatable entity support</w:t>
+      </w:r>
+    </w:p>
+    <w:p>
+      <w:pPr>
+        <w:ind w:left="864"/>
+      </w:pPr>
+      <w:r>
+        <w:rPr>
+          <w:rFonts w:ascii="Arial" w:hAnsi="Arial"/>
+          <w:i/>
+          <w:color w:val="666666"/>
+          <w:sz w:val="18"/>
+        </w:rPr>
+        <w:t>Live-proven. Unblocked CLAIMS-01.</w:t>
+      </w:r>
+    </w:p>
+    <w:p>
+      <w:pPr>
+        <w:ind w:left="360"/>
+      </w:pPr>
+      <w:r>
+        <w:rPr>
+          <w:rFonts w:ascii="Arial" w:hAnsi="Arial"/>
+          <w:color w:val="2E7D32"/>
+          <w:sz w:val="24"/>
+        </w:rPr>
+        <w:t xml:space="preserve">☑  </w:t>
+      </w:r>
+      <w:r>
+        <w:rPr>
+          <w:rFonts w:ascii="Arial" w:hAnsi="Arial"/>
+          <w:b/>
+          <w:color w:val="2E7D32"/>
+          <w:sz w:val="20"/>
+        </w:rPr>
+        <w:t>WO-EX-CLAIMS-01</w:t>
+      </w:r>
+      <w:r>
+        <w:rPr>
+          <w:rFonts w:ascii="Arial" w:hAnsi="Arial"/>
+          <w:color w:val="2E7D32"/>
+          <w:sz w:val="20"/>
+        </w:rPr>
+        <w:t xml:space="preserve">  —  Dynamic token cap + position-aware grouping + aliases</w:t>
+      </w:r>
+    </w:p>
+    <w:p>
+      <w:pPr>
+        <w:ind w:left="864"/>
+      </w:pPr>
+      <w:r>
+        <w:rPr>
+          <w:rFonts w:ascii="Arial" w:hAnsi="Arial"/>
+          <w:i/>
+          <w:color w:val="666666"/>
+          <w:sz w:val="18"/>
+        </w:rPr>
+        <w:t>Live eval baseline: 22/30 (73.3%). Batch 2 aliases deployed. Failures categorized in CLAIMS-02 taxonomy.</w:t>
+      </w:r>
+    </w:p>
+    <w:p>
+      <w:pPr>
+        <w:ind w:left="360"/>
+      </w:pPr>
+      <w:r>
+        <w:rPr>
+          <w:rFonts w:ascii="Arial" w:hAnsi="Arial"/>
+          <w:color w:val="2E7D32"/>
+          <w:sz w:val="24"/>
+        </w:rPr>
+        <w:t xml:space="preserve">☑  </w:t>
+      </w:r>
+      <w:r>
+        <w:rPr>
+          <w:rFonts w:ascii="Arial" w:hAnsi="Arial"/>
+          <w:b/>
+          <w:color w:val="2E7D32"/>
+          <w:sz w:val="20"/>
+        </w:rPr>
+        <w:t>WO-GREETING-01</w:t>
+      </w:r>
+      <w:r>
+        <w:rPr>
+          <w:rFonts w:ascii="Arial" w:hAnsi="Arial"/>
+          <w:color w:val="2E7D32"/>
+          <w:sz w:val="20"/>
+        </w:rPr>
+        <w:t xml:space="preserve">  —  Lori introduces herself on session open</w:t>
+      </w:r>
+    </w:p>
+    <w:p>
+      <w:pPr>
+        <w:ind w:left="864"/>
+      </w:pPr>
+      <w:r>
+        <w:rPr>
+          <w:rFonts w:ascii="Arial" w:hAnsi="Arial"/>
+          <w:i/>
+          <w:color w:val="666666"/>
+          <w:sz w:val="18"/>
+        </w:rPr>
+        <w:t>Live-tested 2026-04-16. All 3 narrators show greeting.</w:t>
+      </w:r>
+    </w:p>
+    <w:p>
+      <w:pPr>
+        <w:ind w:left="360"/>
+      </w:pPr>
+      <w:r>
+        <w:rPr>
+          <w:rFonts w:ascii="Arial" w:hAnsi="Arial"/>
+          <w:color w:val="2E7D32"/>
+          <w:sz w:val="24"/>
+        </w:rPr>
+        <w:t xml:space="preserve">☑  </w:t>
+      </w:r>
+      <w:r>
+        <w:rPr>
+          <w:rFonts w:ascii="Arial" w:hAnsi="Arial"/>
+          <w:b/>
+          <w:color w:val="2E7D32"/>
+          <w:sz w:val="20"/>
+        </w:rPr>
+        <w:t>WO-SCHEMA-02</w:t>
+      </w:r>
+      <w:r>
+        <w:rPr>
+          <w:rFonts w:ascii="Arial" w:hAnsi="Arial"/>
+          <w:color w:val="2E7D32"/>
+          <w:sz w:val="20"/>
+        </w:rPr>
+        <w:t xml:space="preserve">  —  Life map coverage expansion (7 families, 35 fields, ~50 aliases)</w:t>
+      </w:r>
+    </w:p>
+    <w:p>
+      <w:pPr>
+        <w:ind w:left="864"/>
+      </w:pPr>
+      <w:r>
+        <w:rPr>
+          <w:rFonts w:ascii="Arial" w:hAnsi="Arial"/>
+          <w:i/>
+          <w:color w:val="666666"/>
+          <w:sz w:val="18"/>
+        </w:rPr>
+        <w:t>Implementation complete 2026-04-17. Grandparents, military, faith, health, community, pets, travel. Eval suite expanded 30 → 44 cases.</w:t>
+      </w:r>
+    </w:p>
+    <w:p>
+      <w:pPr>
+        <w:ind w:left="360"/>
+      </w:pPr>
+      <w:r>
+        <w:rPr>
+          <w:rFonts w:ascii="Arial" w:hAnsi="Arial"/>
+          <w:color w:val="2E7D32"/>
+          <w:sz w:val="24"/>
+        </w:rPr>
+        <w:t xml:space="preserve">☑  </w:t>
+      </w:r>
+      <w:r>
+        <w:rPr>
+          <w:rFonts w:ascii="Arial" w:hAnsi="Arial"/>
+          <w:b/>
+          <w:color w:val="2E7D32"/>
+          <w:sz w:val="20"/>
+        </w:rPr>
+        <w:t>WO-EX-CLAIMS-02 quick-wins</w:t>
+      </w:r>
+      <w:r>
+        <w:rPr>
+          <w:rFonts w:ascii="Arial" w:hAnsi="Arial"/>
+          <w:color w:val="2E7D32"/>
+          <w:sz w:val="20"/>
+        </w:rPr>
+        <w:t xml:space="preserve">  —  Value-shape rejection, relation allowlist, confidence floor</w:t>
+      </w:r>
+    </w:p>
+    <w:p>
+      <w:pPr>
+        <w:ind w:left="864"/>
+      </w:pPr>
+      <w:r>
+        <w:rPr>
+          <w:rFonts w:ascii="Arial" w:hAnsi="Arial"/>
+          <w:i/>
+          <w:color w:val="666666"/>
+          <w:sz w:val="18"/>
+        </w:rPr>
+        <w:t>3 validators in extract.py. Flag HORNELORE_CLAIMS_VALIDATORS default ON. 32 new tests (114 total).</w:t>
+      </w:r>
+    </w:p>
+    <w:p>
+      <w:pPr>
+        <w:ind w:left="360"/>
+      </w:pPr>
+      <w:r>
+        <w:rPr>
+          <w:rFonts w:ascii="Arial" w:hAnsi="Arial"/>
+          <w:color w:val="2E7D32"/>
+          <w:sz w:val="24"/>
+        </w:rPr>
+        <w:t xml:space="preserve">☑  </w:t>
+      </w:r>
+      <w:r>
+        <w:rPr>
+          <w:rFonts w:ascii="Arial" w:hAnsi="Arial"/>
+          <w:b/>
+          <w:color w:val="2E7D32"/>
+          <w:sz w:val="20"/>
+        </w:rPr>
+        <w:t>WO-LIFE-SPINE-05</w:t>
+      </w:r>
+      <w:r>
+        <w:rPr>
+          <w:rFonts w:ascii="Arial" w:hAnsi="Arial"/>
+          <w:color w:val="2E7D32"/>
+          <w:sz w:val="20"/>
+        </w:rPr>
+        <w:t xml:space="preserve">  —  Phase-aware question composer</w:t>
+      </w:r>
+      <w:r>
+        <w:rPr>
+          <w:rFonts w:ascii="Arial" w:hAnsi="Arial"/>
+          <w:b/>
+          <w:color w:val="CC7A00"/>
+          <w:sz w:val="18"/>
+        </w:rPr>
+        <w:t xml:space="preserve"> [SHIPPED, flag OFF]</w:t>
+      </w:r>
+    </w:p>
+    <w:p>
+      <w:pPr>
+        <w:ind w:left="360"/>
+      </w:pPr>
+      <w:r>
+        <w:rPr>
+          <w:rFonts w:ascii="Arial" w:hAnsi="Arial"/>
+          <w:color w:val="2E7D32"/>
+          <w:sz w:val="24"/>
+        </w:rPr>
+        <w:t xml:space="preserve">☑  </w:t>
+      </w:r>
+      <w:r>
+        <w:rPr>
+          <w:rFonts w:ascii="Arial" w:hAnsi="Arial"/>
+          <w:b/>
+          <w:color w:val="2E7D32"/>
+          <w:sz w:val="20"/>
+        </w:rPr>
+        <w:t>WO-EX-VALIDATE-01</w:t>
+      </w:r>
+      <w:r>
+        <w:rPr>
+          <w:rFonts w:ascii="Arial" w:hAnsi="Arial"/>
+          <w:color w:val="2E7D32"/>
+          <w:sz w:val="20"/>
+        </w:rPr>
+        <w:t xml:space="preserve">  —  Age-math plausibility validator</w:t>
+      </w:r>
+      <w:r>
+        <w:rPr>
+          <w:rFonts w:ascii="Arial" w:hAnsi="Arial"/>
+          <w:b/>
+          <w:color w:val="CC7A00"/>
+          <w:sz w:val="18"/>
+        </w:rPr>
+        <w:t xml:space="preserve"> [SHIPPED, flag OFF]</w:t>
+      </w:r>
+    </w:p>
+    <w:p>
+      <w:pPr>
+        <w:ind w:left="360"/>
+      </w:pPr>
+      <w:r>
+        <w:rPr>
+          <w:rFonts w:ascii="Arial" w:hAnsi="Arial"/>
+          <w:color w:val="2E7D32"/>
+          <w:sz w:val="24"/>
+        </w:rPr>
+        <w:t xml:space="preserve">☑  </w:t>
+      </w:r>
+      <w:r>
+        <w:rPr>
+          <w:rFonts w:ascii="Arial" w:hAnsi="Arial"/>
+          <w:b/>
+          <w:color w:val="2E7D32"/>
+          <w:sz w:val="20"/>
+        </w:rPr>
+        <w:t>Question bank v3</w:t>
+      </w:r>
+      <w:r>
+        <w:rPr>
+          <w:rFonts w:ascii="Arial" w:hAnsi="Arial"/>
+          <w:color w:val="2E7D32"/>
+          <w:sz w:val="20"/>
+        </w:rPr>
+        <w:t xml:space="preserve">  —  36 sub-topics, 144 openers, 108 follow-ups</w:t>
+      </w:r>
+    </w:p>
+    <w:p>
+      <w:pPr>
+        <w:pBdr>
+          <w:bottom w:val="single" w:sz="6" w:space="1" w:color="CC7A00"/>
+        </w:pBdr>
+      </w:pPr>
+      <w:r>
+        <w:rPr>
+          <w:rFonts w:ascii="Arial" w:hAnsi="Arial"/>
+          <w:b/>
+          <w:color w:val="CC7A00"/>
+          <w:sz w:val="26"/>
+        </w:rPr>
+        <w:t>IMPLEMENTATION COMPLETE — Needs Live Test</w:t>
+      </w:r>
+    </w:p>
+    <w:p>
+      <w:pPr>
+        <w:ind w:left="360"/>
+      </w:pPr>
+      <w:r>
+        <w:rPr>
+          <w:rFonts w:ascii="Arial" w:hAnsi="Arial"/>
+          <w:color w:val="CC7A00"/>
+          <w:sz w:val="24"/>
+        </w:rPr>
+        <w:t xml:space="preserve">○  </w:t>
+      </w:r>
+      <w:r>
+        <w:rPr>
+          <w:rFonts w:ascii="Arial" w:hAnsi="Arial"/>
+          <w:b/>
+          <w:sz w:val="20"/>
+        </w:rPr>
+        <w:t>WO-KAWA-UI-01A</w:t>
+      </w:r>
+      <w:r>
+        <w:rPr>
+          <w:rFonts w:ascii="Arial" w:hAnsi="Arial"/>
+          <w:sz w:val="20"/>
+        </w:rPr>
+        <w:t xml:space="preserve">  —  River View UI popover</w:t>
+      </w:r>
+      <w:r>
+        <w:rPr>
+          <w:rFonts w:ascii="Arial" w:hAnsi="Arial"/>
+          <w:b/>
+          <w:color w:val="CC7A00"/>
+          <w:sz w:val="18"/>
+        </w:rPr>
+        <w:t xml:space="preserve"> [AWAITING LIVE TEST]</w:t>
+      </w:r>
+    </w:p>
+    <w:p>
+      <w:pPr>
+        <w:ind w:left="864"/>
+      </w:pPr>
+      <w:r>
+        <w:rPr>
+          <w:rFonts w:ascii="Arial" w:hAnsi="Arial"/>
+          <w:i/>
+          <w:color w:val="666666"/>
+          <w:sz w:val="18"/>
+        </w:rPr>
+        <w:t>Segment list, detail pane, flow/rocks/driftwood/banks/spaces editing, river strip, 4 REST endpoints, local-first JSON storage.</w:t>
+      </w:r>
+    </w:p>
+    <w:p>
+      <w:pPr>
+        <w:ind w:left="360"/>
+      </w:pPr>
+      <w:r>
+        <w:rPr>
+          <w:rFonts w:ascii="Arial" w:hAnsi="Arial"/>
+          <w:color w:val="CC7A00"/>
+          <w:sz w:val="24"/>
+        </w:rPr>
+        <w:t xml:space="preserve">○  </w:t>
+      </w:r>
+      <w:r>
+        <w:rPr>
+          <w:rFonts w:ascii="Arial" w:hAnsi="Arial"/>
+          <w:b/>
+          <w:sz w:val="20"/>
+        </w:rPr>
+        <w:t>WO-KAWA-02A</w:t>
+      </w:r>
+      <w:r>
+        <w:rPr>
+          <w:rFonts w:ascii="Arial" w:hAnsi="Arial"/>
+          <w:sz w:val="20"/>
+        </w:rPr>
+        <w:t xml:space="preserve">  —  Deeper Kawa integration: questioning + memoir modes</w:t>
+      </w:r>
+      <w:r>
+        <w:rPr>
+          <w:rFonts w:ascii="Arial" w:hAnsi="Arial"/>
+          <w:b/>
+          <w:color w:val="CC7A00"/>
+          <w:sz w:val="18"/>
+        </w:rPr>
+        <w:t xml:space="preserve"> [AWAITING LIVE TEST]</w:t>
+      </w:r>
+    </w:p>
+    <w:p>
+      <w:pPr>
+        <w:ind w:left="864"/>
+      </w:pPr>
+      <w:r>
+        <w:rPr>
+          <w:rFonts w:ascii="Arial" w:hAnsi="Arial"/>
+          <w:i/>
+          <w:color w:val="666666"/>
+          <w:sz w:val="18"/>
+        </w:rPr>
+        <w:t>3 interview modes (chronological/hybrid/kawa_reflection), 3 memoir modes, plain-language toggle, prompt_composer directives, Kawa weight metadata.</w:t>
+      </w:r>
+    </w:p>
+    <w:p>
+      <w:pPr>
+        <w:pBdr>
+          <w:bottom w:val="single" w:sz="6" w:space="1" w:color="CC3300"/>
         </w:pBdr>
       </w:pPr>
       <w:r>
@@ -43,7 +593,7 @@
           <w:color w:val="CC3300"/>
           <w:sz w:val="26"/>
         </w:rPr>
-        <w:t>ACTIVE — IN-FLIGHT NOW</w:t>
+        <w:t>ACTIVE — Do Next</w:t>
       </w:r>
     </w:p>
     <w:p>
@@ -63,23 +613,14 @@
           <w:b/>
           <w:sz w:val="20"/>
         </w:rPr>
-        <w:t>WO-EX-CLAIMS-01</w:t>
+        <w:t>Re-run extraction eval</w:t>
       </w:r>
       <w:r>
         <w:rPr>
           <w:rFonts w:ascii="Arial" w:hAnsi="Arial"/>
           <w:sz w:val="20"/>
         </w:rPr>
-        <w:t xml:space="preserve">  —  Extraction pipeline: dynamic token cap + position-aware grouping + aliases</w:t>
-      </w:r>
-      <w:r>
-        <w:rPr>
-          <w:rFonts w:ascii="Arial" w:hAnsi="Arial"/>
-          <w:b/>
-          <w:color w:val="8844CC"/>
-          <w:sz w:val="18"/>
-        </w:rPr>
-        <w:t xml:space="preserve"> [AWAITING EVAL]</w:t>
+        <w:t xml:space="preserve">  —  Expanded 44-case suite (was 30)</w:t>
       </w:r>
     </w:p>
     <w:p>
@@ -93,7 +634,7 @@
           <w:color w:val="666666"/>
           <w:sz w:val="18"/>
         </w:rPr>
-        <w:t>Batch 2 aliases deployed. Live eval running. Was 20/30, expecting 23+.</w:t>
+        <w:t>Measures SCHEMA-02 + CLAIMS-02 impact together. Baseline was 22/30; expecting improvement. 14 new cases for 7 new field families.</w:t>
       </w:r>
     </w:p>
     <w:p>
@@ -153,47 +694,7 @@
           <w:color w:val="444444"/>
           <w:sz w:val="18"/>
         </w:rPr>
-        <w:t>Fix case_002 subject guard false positive (birthOrder stripped)</w:t>
-      </w:r>
-    </w:p>
-    <w:p>
-      <w:pPr>
-        <w:ind w:left="864"/>
-      </w:pPr>
-      <w:r>
-        <w:rPr>
-          <w:rFonts w:ascii="Arial" w:hAnsi="Arial"/>
-          <w:sz w:val="20"/>
-        </w:rPr>
-        <w:t xml:space="preserve">☐  </w:t>
-      </w:r>
-      <w:r>
-        <w:rPr>
-          <w:rFonts w:ascii="Arial" w:hAnsi="Arial"/>
-          <w:color w:val="444444"/>
-          <w:sz w:val="18"/>
-        </w:rPr>
         <w:t>Attack remaining compound entity cases (002, 005, 013, 014, 024, 030)</w:t>
-      </w:r>
-    </w:p>
-    <w:p>
-      <w:pPr>
-        <w:ind w:left="864"/>
-      </w:pPr>
-      <w:r>
-        <w:rPr>
-          <w:rFonts w:ascii="Arial" w:hAnsi="Arial"/>
-          <w:sz w:val="20"/>
-        </w:rPr>
-        <w:t xml:space="preserve">☐  </w:t>
-      </w:r>
-      <w:r>
-        <w:rPr>
-          <w:rFonts w:ascii="Arial" w:hAnsi="Arial"/>
-          <w:color w:val="444444"/>
-          <w:sz w:val="18"/>
-        </w:rPr>
-        <w:t>Categorize remaining failures for next WO</w:t>
       </w:r>
     </w:p>
     <w:p>
@@ -229,104 +730,6 @@
           <w:b/>
           <w:sz w:val="20"/>
         </w:rPr>
-        <w:t>WO-GREETING-01</w:t>
-      </w:r>
-      <w:r>
-        <w:rPr>
-          <w:rFonts w:ascii="Arial" w:hAnsi="Arial"/>
-          <w:sz w:val="20"/>
-        </w:rPr>
-        <w:t xml:space="preserve">  —  Lori introduces herself on session open</w:t>
-      </w:r>
-      <w:r>
-        <w:rPr>
-          <w:rFonts w:ascii="Arial" w:hAnsi="Arial"/>
-          <w:b/>
-          <w:color w:val="CC7A00"/>
-          <w:sz w:val="18"/>
-        </w:rPr>
-        <w:t xml:space="preserve"> [PARTIAL]</w:t>
-      </w:r>
-      <w:r>
-        <w:rPr>
-          <w:rFonts w:ascii="Arial" w:hAnsi="Arial"/>
-          <w:color w:val="999999"/>
-          <w:sz w:val="18"/>
-        </w:rPr>
-        <w:t xml:space="preserve">  ~1 hr</w:t>
-      </w:r>
-    </w:p>
-    <w:p>
-      <w:pPr>
-        <w:ind w:left="864"/>
-      </w:pPr>
-      <w:r>
-        <w:rPr>
-          <w:rFonts w:ascii="Arial" w:hAnsi="Arial"/>
-          <w:i/>
-          <w:color w:val="666666"/>
-          <w:sz w:val="18"/>
-        </w:rPr>
-        <w:t>Backend endpoint done (GET /api/interview/opener). Frontend wiring pending.</w:t>
-      </w:r>
-    </w:p>
-    <w:p>
-      <w:pPr>
-        <w:ind w:left="864"/>
-      </w:pPr>
-      <w:r>
-        <w:rPr>
-          <w:rFonts w:ascii="Arial" w:hAnsi="Arial"/>
-          <w:sz w:val="20"/>
-        </w:rPr>
-        <w:t xml:space="preserve">☐  </w:t>
-      </w:r>
-      <w:r>
-        <w:rPr>
-          <w:rFonts w:ascii="Arial" w:hAnsi="Arial"/>
-          <w:color w:val="444444"/>
-          <w:sz w:val="18"/>
-        </w:rPr>
-        <w:t>Wire opener endpoint to session-open in UI (interview.js)</w:t>
-      </w:r>
-    </w:p>
-    <w:p>
-      <w:pPr>
-        <w:ind w:left="864"/>
-      </w:pPr>
-      <w:r>
-        <w:rPr>
-          <w:rFonts w:ascii="Arial" w:hAnsi="Arial"/>
-          <w:sz w:val="20"/>
-        </w:rPr>
-        <w:t xml:space="preserve">☐  </w:t>
-      </w:r>
-      <w:r>
-        <w:rPr>
-          <w:rFonts w:ascii="Arial" w:hAnsi="Arial"/>
-          <w:color w:val="444444"/>
-          <w:sz w:val="18"/>
-        </w:rPr>
-        <w:t>Test with fresh session — Lori should greet before first question</w:t>
-      </w:r>
-    </w:p>
-    <w:p>
-      <w:pPr>
-        <w:ind w:left="360"/>
-      </w:pPr>
-      <w:r>
-        <w:rPr>
-          <w:rFonts w:ascii="Arial" w:hAnsi="Arial"/>
-          <w:sz w:val="24"/>
-        </w:rPr>
-        <w:t xml:space="preserve">☐  </w:t>
-      </w:r>
-      <w:r>
-        <w:rPr>
-          <w:rFonts w:ascii="Arial" w:hAnsi="Arial"/>
-          <w:b/>
-          <w:sz w:val="20"/>
-        </w:rPr>
         <w:t>WO-INTENT-01</w:t>
       </w:r>
       <w:r>
@@ -334,7 +737,7 @@
           <w:rFonts w:ascii="Arial" w:hAnsi="Arial"/>
           <w:sz w:val="20"/>
         </w:rPr>
-        <w:t xml:space="preserve">  —  Narrator says "let's talk about X" and Lori ignores it</w:t>
+        <w:t xml:space="preserve">  —  Narrator says “let’s talk about X” and Lori ignores it</w:t>
       </w:r>
       <w:r>
         <w:rPr>
@@ -425,7 +828,7 @@
           <w:color w:val="444444"/>
           <w:sz w:val="18"/>
         </w:rPr>
-        <w:t>Test: narrator says 'I want to talk about my parents' mid-school-section</w:t>
+        <w:t>Test: narrator says ‘I want to talk about my parents’ mid-school-section</w:t>
       </w:r>
     </w:p>
     <w:p>
@@ -499,7 +902,7 @@
           <w:color w:val="1A5C8A"/>
           <w:sz w:val="26"/>
         </w:rPr>
-        <w:t>EXTRACTION PIPELINE — Next Wave</w:t>
+        <w:t>EXTRACTION PIPELINE — Remaining</w:t>
       </w:r>
     </w:p>
     <w:p>
@@ -519,31 +922,14 @@
           <w:b/>
           <w:sz w:val="20"/>
         </w:rPr>
-        <w:t>WO-SCHEMA-02</w:t>
+        <w:t>WO-EX-CLAIMS-02 remaining</w:t>
       </w:r>
       <w:r>
         <w:rPr>
           <w:rFonts w:ascii="Arial" w:hAnsi="Arial"/>
           <w:sz w:val="20"/>
         </w:rPr>
-        <w:t xml:space="preserve">  —  Life map coverage expansion (grandparents, military, faith, health, community, pets, travel)</w:t>
-      </w:r>
-      <w:r>
-        <w:rPr>
-          <w:rFonts w:ascii="Arial" w:hAnsi="Arial"/>
-          <w:b/>
-          <w:color w:val="1A5C8A"/>
-          <w:sz w:val="18"/>
-        </w:rPr>
-        <w:t xml:space="preserve"> [SPECCED]</w:t>
-      </w:r>
-      <w:r>
-        <w:rPr>
-          <w:rFonts w:ascii="Arial" w:hAnsi="Arial"/>
-          <w:color w:val="999999"/>
-          <w:sz w:val="18"/>
-        </w:rPr>
-        <w:t xml:space="preserve">  ~1-2 sessions</w:t>
+        <w:t xml:space="preserve">  —  Entity coherence, compound splitting, narrator style tuning</w:t>
       </w:r>
     </w:p>
     <w:p>
@@ -557,127 +943,7 @@
           <w:color w:val="666666"/>
           <w:sz w:val="18"/>
         </w:rPr>
-        <w:t>Full execution pack saved. Grandparents first (questionnaire surface exists).</w:t>
-      </w:r>
-    </w:p>
-    <w:p>
-      <w:pPr>
-        <w:ind w:left="864"/>
-      </w:pPr>
-      <w:r>
-        <w:rPr>
-          <w:rFonts w:ascii="Arial" w:hAnsi="Arial"/>
-          <w:sz w:val="20"/>
-        </w:rPr>
-        <w:t xml:space="preserve">☐  </w:t>
-      </w:r>
-      <w:r>
-        <w:rPr>
-          <w:rFonts w:ascii="Arial" w:hAnsi="Arial"/>
-          <w:color w:val="444444"/>
-          <w:sz w:val="18"/>
-        </w:rPr>
-        <w:t>Phase 1: Add canonical fields to EXTRACTABLE_FIELDS (7 families)</w:t>
-      </w:r>
-    </w:p>
-    <w:p>
-      <w:pPr>
-        <w:ind w:left="864"/>
-      </w:pPr>
-      <w:r>
-        <w:rPr>
-          <w:rFonts w:ascii="Arial" w:hAnsi="Arial"/>
-          <w:sz w:val="20"/>
-        </w:rPr>
-        <w:t xml:space="preserve">☐  </w:t>
-      </w:r>
-      <w:r>
-        <w:rPr>
-          <w:rFonts w:ascii="Arial" w:hAnsi="Arial"/>
-          <w:color w:val="444444"/>
-          <w:sz w:val="18"/>
-        </w:rPr>
-        <w:t>Phase 2: Add aliases for LLM-invented paths</w:t>
-      </w:r>
-    </w:p>
-    <w:p>
-      <w:pPr>
-        <w:ind w:left="864"/>
-      </w:pPr>
-      <w:r>
-        <w:rPr>
-          <w:rFonts w:ascii="Arial" w:hAnsi="Arial"/>
-          <w:sz w:val="20"/>
-        </w:rPr>
-        <w:t xml:space="preserve">☐  </w:t>
-      </w:r>
-      <w:r>
-        <w:rPr>
-          <w:rFonts w:ascii="Arial" w:hAnsi="Arial"/>
-          <w:color w:val="444444"/>
-          <w:sz w:val="18"/>
-        </w:rPr>
-        <w:t>Phase 3: Update extraction prompt examples</w:t>
-      </w:r>
-    </w:p>
-    <w:p>
-      <w:pPr>
-        <w:ind w:left="864"/>
-      </w:pPr>
-      <w:r>
-        <w:rPr>
-          <w:rFonts w:ascii="Arial" w:hAnsi="Arial"/>
-          <w:sz w:val="20"/>
-        </w:rPr>
-        <w:t xml:space="preserve">☐  </w:t>
-      </w:r>
-      <w:r>
-        <w:rPr>
-          <w:rFonts w:ascii="Arial" w:hAnsi="Arial"/>
-          <w:color w:val="444444"/>
-          <w:sz w:val="18"/>
-        </w:rPr>
-        <w:t>Phase 4: Add projection-map entries</w:t>
-      </w:r>
-    </w:p>
-    <w:p>
-      <w:pPr>
-        <w:ind w:left="864"/>
-      </w:pPr>
-      <w:r>
-        <w:rPr>
-          <w:rFonts w:ascii="Arial" w:hAnsi="Arial"/>
-          <w:sz w:val="20"/>
-        </w:rPr>
-        <w:t xml:space="preserve">☐  </w:t>
-      </w:r>
-      <w:r>
-        <w:rPr>
-          <w:rFonts w:ascii="Arial" w:hAnsi="Arial"/>
-          <w:color w:val="444444"/>
-          <w:sz w:val="18"/>
-        </w:rPr>
-        <w:t>Phase 5: Add 14 new eval cases (2 per family)</w:t>
-      </w:r>
-    </w:p>
-    <w:p>
-      <w:pPr>
-        <w:ind w:left="864"/>
-      </w:pPr>
-      <w:r>
-        <w:rPr>
-          <w:rFonts w:ascii="Arial" w:hAnsi="Arial"/>
-          <w:sz w:val="20"/>
-        </w:rPr>
-        <w:t xml:space="preserve">☐  </w:t>
-      </w:r>
-      <w:r>
-        <w:rPr>
-          <w:rFonts w:ascii="Arial" w:hAnsi="Arial"/>
-          <w:color w:val="444444"/>
-          <w:sz w:val="18"/>
-        </w:rPr>
-        <w:t>Phase 6: Rerun eval, report coverage delta</w:t>
+        <w:t>Quick-wins shipped. Deeper structural fixes still needed for ~8 failing eval cases.</w:t>
       </w:r>
     </w:p>
     <w:p>
@@ -1030,7 +1296,7 @@
           <w:rFonts w:ascii="Arial" w:hAnsi="Arial"/>
           <w:sz w:val="20"/>
         </w:rPr>
-        <w:t xml:space="preserve">  —  Show Phase G suppression reason ("we already have this") instead of silent drop</w:t>
+        <w:t xml:space="preserve">  —  Show Phase G suppression reason (“we already have this”) instead of silent drop</w:t>
       </w:r>
       <w:r>
         <w:rPr>
@@ -1135,7 +1401,7 @@
           <w:color w:val="1A5C8A"/>
           <w:sz w:val="26"/>
         </w:rPr>
-        <w:t>MEMOIR SYSTEM — Future</w:t>
+        <w:t>MEMOIR SYSTEM + KAWA — Future</w:t>
       </w:r>
     </w:p>
     <w:p>
@@ -1328,20 +1594,19 @@
         <w:t>Phase 7: Export upgrade (DOCX)</w:t>
       </w:r>
     </w:p>
+    <w:p/>
     <w:p>
       <w:pPr>
-        <w:pBdr>
-          <w:bottom w:val="single" w:sz="6" w:space="1" w:color="1A5C8A"/>
-        </w:pBdr>
+        <w:ind w:left="360"/>
       </w:pPr>
       <w:r>
         <w:rPr>
           <w:rFonts w:ascii="Arial" w:hAnsi="Arial"/>
           <w:b/>
-          <w:color w:val="8844CC"/>
-          <w:sz w:val="26"/>
+          <w:color w:val="1A5C8A"/>
+          <w:sz w:val="22"/>
         </w:rPr>
-        <w:t>ENV FLAGS — Shipped But Not Activated</w:t>
+        <w:t>Kawa River Layer</w:t>
       </w:r>
     </w:p>
     <w:p>
@@ -1361,23 +1626,23 @@
           <w:b/>
           <w:sz w:val="20"/>
         </w:rPr>
-        <w:t>HORNELORE_PHASE_AWARE_QUESTIONS</w:t>
+        <w:t>WO-KAWA-01</w:t>
       </w:r>
       <w:r>
         <w:rPr>
           <w:rFonts w:ascii="Arial" w:hAnsi="Arial"/>
           <w:sz w:val="20"/>
         </w:rPr>
-        <w:t xml:space="preserve">  —  Phase-aware question composer (WO-LIFE-SPINE-05) — currently OFF</w:t>
+        <w:t xml:space="preserve">  —  LLM-driven Kawa proposals (10 phases)</w:t>
       </w:r>
       <w:r>
         <w:rPr>
           <w:rFonts w:ascii="Arial" w:hAnsi="Arial"/>
           <w:b/>
-          <w:color w:val="999999"/>
+          <w:color w:val="1A5C8A"/>
           <w:sz w:val="18"/>
         </w:rPr>
-        <w:t xml:space="preserve"> [SHIPPED]</w:t>
+        <w:t xml:space="preserve"> [SPECCED]</w:t>
       </w:r>
     </w:p>
     <w:p>
@@ -1391,7 +1656,7 @@
           <w:color w:val="666666"/>
           <w:sz w:val="18"/>
         </w:rPr>
-        <w:t>Set to 1 in .env, restart API, confirm question IDs start with qb: in network tab.</w:t>
+        <w:t>Wire LLM into kawa_projection.py for real proposals. Phase 1 is next after INTENT-01.</w:t>
       </w:r>
     </w:p>
     <w:p>
@@ -1411,23 +1676,50 @@
           <w:b/>
           <w:sz w:val="20"/>
         </w:rPr>
-        <w:t>HORNELORE_AGE_VALIDATOR</w:t>
+        <w:t>WO-KAWA-02 remaining</w:t>
       </w:r>
       <w:r>
         <w:rPr>
           <w:rFonts w:ascii="Arial" w:hAnsi="Arial"/>
           <w:sz w:val="20"/>
         </w:rPr>
-        <w:t xml:space="preserve">  —  Age-math plausibility filter (WO-EX-VALIDATE-01) — currently OFF</w:t>
+        <w:t xml:space="preserve">  —  Phases 4-9: storage promotion, chapter weighting, eval hooks</w:t>
+      </w:r>
+    </w:p>
+    <w:p>
+      <w:pPr>
+        <w:ind w:left="360"/>
+      </w:pPr>
+      <w:r>
+        <w:rPr>
+          <w:rFonts w:ascii="Arial" w:hAnsi="Arial"/>
+          <w:sz w:val="24"/>
+        </w:rPr>
+        <w:t xml:space="preserve">☐  </w:t>
       </w:r>
       <w:r>
         <w:rPr>
           <w:rFonts w:ascii="Arial" w:hAnsi="Arial"/>
           <w:b/>
-          <w:color w:val="999999"/>
+          <w:sz w:val="20"/>
+        </w:rPr>
+        <w:t>WO-KAWA-03A</w:t>
+      </w:r>
+      <w:r>
+        <w:rPr>
+          <w:rFonts w:ascii="Arial" w:hAnsi="Arial"/>
+          <w:sz w:val="20"/>
+        </w:rPr>
+        <w:t xml:space="preserve">  —  River canvas layout engine + SVG renderer</w:t>
+      </w:r>
+      <w:r>
+        <w:rPr>
+          <w:rFonts w:ascii="Arial" w:hAnsi="Arial"/>
+          <w:b/>
+          <w:color w:val="1A5C8A"/>
           <w:sz w:val="18"/>
         </w:rPr>
-        <w:t xml:space="preserve"> [SHIPPED]</w:t>
+        <w:t xml:space="preserve"> [SPECCED]</w:t>
       </w:r>
     </w:p>
     <w:p>
@@ -1441,7 +1733,276 @@
           <w:color w:val="666666"/>
           <w:sz w:val="18"/>
         </w:rPr>
-        <w:t>Set to 1 in .env. Drops events that predate birth, age &lt; min for civic events.</w:t>
+        <w:t>river-layout.js (pure functions) + river-renderer.js (SVG DOM). Single-segment view, mounts inside existing kawaPanel. Spec finalized.</w:t>
+      </w:r>
+    </w:p>
+    <w:p>
+      <w:pPr>
+        <w:ind w:left="360"/>
+      </w:pPr>
+      <w:r>
+        <w:rPr>
+          <w:rFonts w:ascii="Arial" w:hAnsi="Arial"/>
+          <w:sz w:val="24"/>
+        </w:rPr>
+        <w:t xml:space="preserve">☐  </w:t>
+      </w:r>
+      <w:r>
+        <w:rPr>
+          <w:rFonts w:ascii="Arial" w:hAnsi="Arial"/>
+          <w:b/>
+          <w:sz w:val="20"/>
+        </w:rPr>
+        <w:t>WO-KAWA-03B</w:t>
+      </w:r>
+      <w:r>
+        <w:rPr>
+          <w:rFonts w:ascii="Arial" w:hAnsi="Arial"/>
+          <w:sz w:val="20"/>
+        </w:rPr>
+        <w:t xml:space="preserve">  —  Nudge interaction (drag-to-adjust confidence/position)</w:t>
+      </w:r>
+      <w:r>
+        <w:rPr>
+          <w:rFonts w:ascii="Arial" w:hAnsi="Arial"/>
+          <w:b/>
+          <w:color w:val="999999"/>
+          <w:sz w:val="18"/>
+        </w:rPr>
+        <w:t xml:space="preserve"> [NOT YET SPECCED]</w:t>
+      </w:r>
+    </w:p>
+    <w:p>
+      <w:pPr>
+        <w:ind w:left="360"/>
+      </w:pPr>
+      <w:r>
+        <w:rPr>
+          <w:rFonts w:ascii="Arial" w:hAnsi="Arial"/>
+          <w:sz w:val="24"/>
+        </w:rPr>
+        <w:t xml:space="preserve">☐  </w:t>
+      </w:r>
+      <w:r>
+        <w:rPr>
+          <w:rFonts w:ascii="Arial" w:hAnsi="Arial"/>
+          <w:b/>
+          <w:sz w:val="20"/>
+        </w:rPr>
+        <w:t>WO-KAWA-03C</w:t>
+      </w:r>
+      <w:r>
+        <w:rPr>
+          <w:rFonts w:ascii="Arial" w:hAnsi="Arial"/>
+          <w:sz w:val="20"/>
+        </w:rPr>
+        <w:t xml:space="preserve">  —  Proposal / mood loop</w:t>
+      </w:r>
+      <w:r>
+        <w:rPr>
+          <w:rFonts w:ascii="Arial" w:hAnsi="Arial"/>
+          <w:b/>
+          <w:color w:val="999999"/>
+          <w:sz w:val="18"/>
+        </w:rPr>
+        <w:t xml:space="preserve"> [NOT YET SPECCED]</w:t>
+      </w:r>
+    </w:p>
+    <w:p>
+      <w:pPr>
+        <w:ind w:left="360"/>
+      </w:pPr>
+      <w:r>
+        <w:rPr>
+          <w:rFonts w:ascii="Arial" w:hAnsi="Arial"/>
+          <w:sz w:val="24"/>
+        </w:rPr>
+        <w:t xml:space="preserve">☐  </w:t>
+      </w:r>
+      <w:r>
+        <w:rPr>
+          <w:rFonts w:ascii="Arial" w:hAnsi="Arial"/>
+          <w:b/>
+          <w:sz w:val="20"/>
+        </w:rPr>
+        <w:t>WO-KAWA-04</w:t>
+      </w:r>
+      <w:r>
+        <w:rPr>
+          <w:rFonts w:ascii="Arial" w:hAnsi="Arial"/>
+          <w:sz w:val="20"/>
+        </w:rPr>
+        <w:t xml:space="preserve">  —  Tributaries and influence mapping</w:t>
+      </w:r>
+      <w:r>
+        <w:rPr>
+          <w:rFonts w:ascii="Arial" w:hAnsi="Arial"/>
+          <w:b/>
+          <w:color w:val="999999"/>
+          <w:sz w:val="18"/>
+        </w:rPr>
+        <w:t xml:space="preserve"> [NOT YET SPECCED]</w:t>
+      </w:r>
+    </w:p>
+    <w:p>
+      <w:pPr>
+        <w:pBdr>
+          <w:bottom w:val="single" w:sz="6" w:space="1" w:color="1A5C8A"/>
+        </w:pBdr>
+      </w:pPr>
+      <w:r>
+        <w:rPr>
+          <w:rFonts w:ascii="Arial" w:hAnsi="Arial"/>
+          <w:b/>
+          <w:color w:val="8844CC"/>
+          <w:sz w:val="26"/>
+        </w:rPr>
+        <w:t>ENV FLAGS — Current State</w:t>
+      </w:r>
+    </w:p>
+    <w:p>
+      <w:pPr>
+        <w:ind w:left="360"/>
+      </w:pPr>
+      <w:r>
+        <w:rPr>
+          <w:rFonts w:ascii="Arial" w:hAnsi="Arial"/>
+          <w:color w:val="2E7D32"/>
+          <w:sz w:val="24"/>
+        </w:rPr>
+        <w:t xml:space="preserve">☑  </w:t>
+      </w:r>
+      <w:r>
+        <w:rPr>
+          <w:rFonts w:ascii="Arial" w:hAnsi="Arial"/>
+          <w:b/>
+          <w:sz w:val="20"/>
+        </w:rPr>
+        <w:t>HORNELORE_TRUTH_V2 = 1</w:t>
+      </w:r>
+      <w:r>
+        <w:rPr>
+          <w:rFonts w:ascii="Arial" w:hAnsi="Arial"/>
+          <w:color w:val="2E7D32"/>
+          <w:sz w:val="18"/>
+        </w:rPr>
+        <w:t xml:space="preserve"> (ON)</w:t>
+      </w:r>
+    </w:p>
+    <w:p>
+      <w:pPr>
+        <w:ind w:left="360"/>
+      </w:pPr>
+      <w:r>
+        <w:rPr>
+          <w:rFonts w:ascii="Arial" w:hAnsi="Arial"/>
+          <w:color w:val="2E7D32"/>
+          <w:sz w:val="24"/>
+        </w:rPr>
+        <w:t xml:space="preserve">☑  </w:t>
+      </w:r>
+      <w:r>
+        <w:rPr>
+          <w:rFonts w:ascii="Arial" w:hAnsi="Arial"/>
+          <w:b/>
+          <w:sz w:val="20"/>
+        </w:rPr>
+        <w:t>HORNELORE_TRUTH_V2_PROFILE = 1</w:t>
+      </w:r>
+      <w:r>
+        <w:rPr>
+          <w:rFonts w:ascii="Arial" w:hAnsi="Arial"/>
+          <w:color w:val="2E7D32"/>
+          <w:sz w:val="18"/>
+        </w:rPr>
+        <w:t xml:space="preserve"> (ON)</w:t>
+      </w:r>
+    </w:p>
+    <w:p>
+      <w:pPr>
+        <w:ind w:left="360"/>
+      </w:pPr>
+      <w:r>
+        <w:rPr>
+          <w:rFonts w:ascii="Arial" w:hAnsi="Arial"/>
+          <w:color w:val="2E7D32"/>
+          <w:sz w:val="24"/>
+        </w:rPr>
+        <w:t xml:space="preserve">☑  </w:t>
+      </w:r>
+      <w:r>
+        <w:rPr>
+          <w:rFonts w:ascii="Arial" w:hAnsi="Arial"/>
+          <w:b/>
+          <w:sz w:val="20"/>
+        </w:rPr>
+        <w:t>HORNELORE_CLAIMS_VALIDATORS = 1</w:t>
+      </w:r>
+      <w:r>
+        <w:rPr>
+          <w:rFonts w:ascii="Arial" w:hAnsi="Arial"/>
+          <w:color w:val="2E7D32"/>
+          <w:sz w:val="18"/>
+        </w:rPr>
+        <w:t xml:space="preserve"> (ON)</w:t>
+      </w:r>
+    </w:p>
+    <w:p>
+      <w:pPr>
+        <w:ind w:left="360"/>
+      </w:pPr>
+      <w:r>
+        <w:rPr>
+          <w:rFonts w:ascii="Arial" w:hAnsi="Arial"/>
+          <w:color w:val="CC7A00"/>
+          <w:sz w:val="24"/>
+        </w:rPr>
+        <w:t xml:space="preserve">○  </w:t>
+      </w:r>
+      <w:r>
+        <w:rPr>
+          <w:rFonts w:ascii="Arial" w:hAnsi="Arial"/>
+          <w:b/>
+          <w:sz w:val="20"/>
+        </w:rPr>
+        <w:t>HORNELORE_PHASE_AWARE_QUESTIONS = 0</w:t>
+      </w:r>
+      <w:r>
+        <w:rPr>
+          <w:rFonts w:ascii="Arial" w:hAnsi="Arial"/>
+          <w:color w:val="CC7A00"/>
+          <w:sz w:val="18"/>
+        </w:rPr>
+        <w:t xml:space="preserve"> (OFF — ready to activate)</w:t>
+      </w:r>
+    </w:p>
+    <w:p>
+      <w:pPr>
+        <w:ind w:left="360"/>
+      </w:pPr>
+      <w:r>
+        <w:rPr>
+          <w:rFonts w:ascii="Arial" w:hAnsi="Arial"/>
+          <w:color w:val="CC7A00"/>
+          <w:sz w:val="24"/>
+        </w:rPr>
+        <w:t xml:space="preserve">○  </w:t>
+      </w:r>
+      <w:r>
+        <w:rPr>
+          <w:rFonts w:ascii="Arial" w:hAnsi="Arial"/>
+          <w:b/>
+          <w:sz w:val="20"/>
+        </w:rPr>
+        <w:t>HORNELORE_AGE_VALIDATOR = 0</w:t>
+      </w:r>
+      <w:r>
+        <w:rPr>
+          <w:rFonts w:ascii="Arial" w:hAnsi="Arial"/>
+          <w:color w:val="CC7A00"/>
+          <w:sz w:val="18"/>
+        </w:rPr>
+        <w:t xml:space="preserve"> (OFF — ready to activate)</w:t>
       </w:r>
     </w:p>
     <w:p>
@@ -1464,6 +2025,69 @@
       <w:pPr>
         <w:ind w:left="360"/>
       </w:pPr>
+    </w:p>
+    <w:p>
+      <w:pPr>
+        <w:ind w:left="360"/>
+      </w:pPr>
+      <w:r>
+        <w:rPr>
+          <w:rFonts w:ascii="Arial" w:hAnsi="Arial"/>
+          <w:b/>
+          <w:sz w:val="18"/>
+        </w:rPr>
+        <w:t>•  WO-KAWA-01_Spec.md</w:t>
+      </w:r>
+      <w:r>
+        <w:rPr>
+          <w:rFonts w:ascii="Arial" w:hAnsi="Arial"/>
+          <w:color w:val="666666"/>
+          <w:sz w:val="18"/>
+        </w:rPr>
+        <w:t xml:space="preserve">  —  Full 10-phase Kawa data/engine work order</w:t>
+      </w:r>
+    </w:p>
+    <w:p>
+      <w:pPr>
+        <w:ind w:left="360"/>
+      </w:pPr>
+      <w:r>
+        <w:rPr>
+          <w:rFonts w:ascii="Arial" w:hAnsi="Arial"/>
+          <w:b/>
+          <w:sz w:val="18"/>
+        </w:rPr>
+        <w:t>•  WO-KAWA-UI-01_Spec.md</w:t>
+      </w:r>
+      <w:r>
+        <w:rPr>
+          <w:rFonts w:ascii="Arial" w:hAnsi="Arial"/>
+          <w:color w:val="666666"/>
+          <w:sz w:val="18"/>
+        </w:rPr>
+        <w:t xml:space="preserve">  —  Full River View UI work order</w:t>
+      </w:r>
+    </w:p>
+    <w:p>
+      <w:pPr>
+        <w:ind w:left="360"/>
+      </w:pPr>
+      <w:r>
+        <w:rPr>
+          <w:rFonts w:ascii="Arial" w:hAnsi="Arial"/>
+          <w:b/>
+          <w:sz w:val="18"/>
+        </w:rPr>
+        <w:t>•  WO-KAWA-03A_Spec.md</w:t>
+      </w:r>
+      <w:r>
+        <w:rPr>
+          <w:rFonts w:ascii="Arial" w:hAnsi="Arial"/>
+          <w:color w:val="666666"/>
+          <w:sz w:val="18"/>
+        </w:rPr>
+        <w:t xml:space="preserve">  —  River canvas layout engine spec (corrected)</w:t>
+      </w:r>
     </w:p>
     <w:p>
       <w:pPr>
@@ -1549,7 +2173,104 @@
         <w:t xml:space="preserve">  —  Laptop bring-up + rolling state summary</w:t>
       </w:r>
     </w:p>
+    <w:p>
+      <w:pPr>
+        <w:ind w:left="360"/>
+      </w:pPr>
+      <w:r>
+        <w:rPr>
+          <w:rFonts w:ascii="Arial" w:hAnsi="Arial"/>
+          <w:b/>
+          <w:sz w:val="18"/>
+        </w:rPr>
+        <w:t>•  docs/CLAIMS-02_failure_taxonomy.md</w:t>
+      </w:r>
+      <w:r>
+        <w:rPr>
+          <w:rFonts w:ascii="Arial" w:hAnsi="Arial"/>
+          <w:color w:val="666666"/>
+          <w:sz w:val="18"/>
+        </w:rPr>
+        <w:t xml:space="preserve">  —  Failure root cause analysis + fix priorities</w:t>
+      </w:r>
+    </w:p>
+    <w:p>
+      <w:pPr>
+        <w:ind w:left="360"/>
+      </w:pPr>
+      <w:r>
+        <w:rPr>
+          <w:rFonts w:ascii="Arial" w:hAnsi="Arial"/>
+          <w:b/>
+          <w:sz w:val="18"/>
+        </w:rPr>
+        <w:t>•  docs/reports/WO-KAWA-UI-01A_REPORT.md</w:t>
+      </w:r>
+      <w:r>
+        <w:rPr>
+          <w:rFonts w:ascii="Arial" w:hAnsi="Arial"/>
+          <w:color w:val="666666"/>
+          <w:sz w:val="18"/>
+        </w:rPr>
+        <w:t xml:space="preserve">  —  River View implementation report</w:t>
+      </w:r>
+    </w:p>
+    <w:p>
+      <w:pPr>
+        <w:ind w:left="360"/>
+      </w:pPr>
+      <w:r>
+        <w:rPr>
+          <w:rFonts w:ascii="Arial" w:hAnsi="Arial"/>
+          <w:b/>
+          <w:sz w:val="18"/>
+        </w:rPr>
+        <w:t>•  docs/reports/WO-KAWA-02A_REPORT.md</w:t>
+      </w:r>
+      <w:r>
+        <w:rPr>
+          <w:rFonts w:ascii="Arial" w:hAnsi="Arial"/>
+          <w:color w:val="666666"/>
+          <w:sz w:val="18"/>
+        </w:rPr>
+        <w:t xml:space="preserve">  —  Kawa questioning + memoir integration report</w:t>
+      </w:r>
+    </w:p>
+    <w:p>
+      <w:pPr>
+        <w:ind w:left="360"/>
+      </w:pPr>
+      <w:r>
+        <w:rPr>
+          <w:rFonts w:ascii="Arial" w:hAnsi="Arial"/>
+          <w:b/>
+          <w:sz w:val="18"/>
+        </w:rPr>
+        <w:t>•  docs/references/</w:t>
+      </w:r>
+      <w:r>
+        <w:rPr>
+          <w:rFonts w:ascii="Arial" w:hAnsi="Arial"/>
+          <w:color w:val="666666"/>
+          <w:sz w:val="18"/>
+        </w:rPr>
+        <w:t xml:space="preserve">  —  4 Kawa/OT reference papers (Iwama, Newbury/Lape, Crepeau, Norell)</w:t>
+      </w:r>
+    </w:p>
     <w:p/>
+    <w:p>
+      <w:pPr>
+        <w:jc w:val="center"/>
+      </w:pPr>
+      <w:r>
+        <w:rPr>
+          <w:rFonts w:ascii="Arial" w:hAnsi="Arial"/>
+          <w:color w:val="999999"/>
+          <w:sz w:val="16"/>
+        </w:rPr>
+        <w:t>114 unit tests across 6 suites, all passing</w:t>
+      </w:r>
+    </w:p>
     <w:p>
       <w:pPr>
         <w:jc w:val="center"/>

</xml_diff>